<commit_message>
Update word template again
</commit_message>
<xml_diff>
--- a/word_template.docx
+++ b/word_template.docx
@@ -9698,14 +9698,15 @@
         </w:rPr>
       </w:pPr>
       <w:r>
-        <w:rPr>
-          <w:rFonts w:ascii="Times New Roman" w:eastAsia="Times New Roman" w:hAnsi="Times New Roman" w:cs="Times New Roman"/>
-          <w:kern w:val="0"/>
-          <w:sz w:val="24"/>
-          <w:lang w:val="en-IN" w:eastAsia="en-GB"/>
-          <w14:ligatures w14:val="none"/>
-        </w:rPr>
-        <w:t>{{data.Environmental_Social_Governance_ESG.Current_Processes_Key_Findings.content}}</w:t>
+        <w:t>{{</w:t>
+      </w:r>
+      <w:proofErr w:type="gramStart"/>
+      <w:r>
+        <w:t>data.Environmental</w:t>
+      </w:r>
+      <w:proofErr w:type="gramEnd"/>
+      <w:r>
+        <w:t>_Social_and_Governance_ESG_Processes.Current_Processes_Key_Findings.content}}</w:t>
       </w:r>
     </w:p>
     <w:p>
@@ -9737,29 +9738,7 @@
           <w:lang w:val="en-IN" w:eastAsia="en-GB"/>
           <w14:ligatures w14:val="none"/>
         </w:rPr>
-        <w:t>{{</w:t>
-      </w:r>
-      <w:proofErr w:type="spellStart"/>
-      <w:r>
-        <w:rPr>
-          <w:rFonts w:ascii="Times New Roman" w:eastAsia="Times New Roman" w:hAnsi="Times New Roman" w:cs="Times New Roman"/>
-          <w:kern w:val="0"/>
-          <w:sz w:val="24"/>
-          <w:lang w:val="en-IN" w:eastAsia="en-GB"/>
-          <w14:ligatures w14:val="none"/>
-        </w:rPr>
-        <w:t>data.Environmental_Social_Governance_ESG.Pain_Points.content</w:t>
-      </w:r>
-      <w:proofErr w:type="spellEnd"/>
-      <w:r>
-        <w:rPr>
-          <w:rFonts w:ascii="Times New Roman" w:eastAsia="Times New Roman" w:hAnsi="Times New Roman" w:cs="Times New Roman"/>
-          <w:kern w:val="0"/>
-          <w:sz w:val="24"/>
-          <w:lang w:val="en-IN" w:eastAsia="en-GB"/>
-          <w14:ligatures w14:val="none"/>
-        </w:rPr>
-        <w:t>}}</w:t>
+        <w:t>{{data.Environmental_Social_and_Governance_ESG_Processes.Pain_Points.content}}</w:t>
       </w:r>
     </w:p>
     <w:p/>
@@ -9785,14 +9764,15 @@
         </w:rPr>
       </w:pPr>
       <w:r>
-        <w:rPr>
-          <w:rFonts w:ascii="Times New Roman" w:eastAsia="Times New Roman" w:hAnsi="Times New Roman" w:cs="Times New Roman"/>
-          <w:kern w:val="0"/>
-          <w:sz w:val="24"/>
-          <w:lang w:val="en-IN" w:eastAsia="en-GB"/>
-          <w14:ligatures w14:val="none"/>
-        </w:rPr>
-        <w:t>{{data.Environmental_Social_Governance_ESG.Proposed_SAP_Solutions_Mapping.content}}</w:t>
+        <w:t>{{</w:t>
+      </w:r>
+      <w:proofErr w:type="gramStart"/>
+      <w:r>
+        <w:t>data.Environmental</w:t>
+      </w:r>
+      <w:proofErr w:type="gramEnd"/>
+      <w:r>
+        <w:t>_Social_and_Governance_ESG_Processes.Proposed_SAP_Solutions_Mapping.content}}</w:t>
       </w:r>
     </w:p>
     <w:p/>
@@ -9815,8 +9795,13 @@
         <w:pStyle w:val="HTMLPreformatted"/>
       </w:pPr>
       <w:r>
-        <w:t>{{data.Environmental_Social_Governance_ESG.Major_Gaps_and_Integrations.content}}</w:t>
-      </w:r>
+        <w:t>{{data.Environmental_Social_and_Governance_ESG_Processes.Major_Gaps_and_Integrations.content}}</w:t>
+      </w:r>
+    </w:p>
+    <w:p>
+      <w:pPr>
+        <w:pStyle w:val="HTMLPreformatted"/>
+      </w:pPr>
     </w:p>
     <w:p>
       <w:pPr>
@@ -21058,6 +21043,7 @@
     <w:rsid w:val="00557961"/>
     <w:rsid w:val="005616DB"/>
     <w:rsid w:val="0059300A"/>
+    <w:rsid w:val="005D2BDA"/>
     <w:rsid w:val="00634F0D"/>
     <w:rsid w:val="006361F8"/>
     <w:rsid w:val="0064559B"/>
@@ -21074,6 +21060,7 @@
     <w:rsid w:val="00C25536"/>
     <w:rsid w:val="00C7520D"/>
     <w:rsid w:val="00CA3119"/>
+    <w:rsid w:val="00CE222C"/>
     <w:rsid w:val="00D3186C"/>
     <w:rsid w:val="00DF3800"/>
     <w:rsid w:val="00E05A4E"/>
@@ -21829,16 +21816,6 @@
 </file>
 
 <file path=customXml/item1.xml><?xml version="1.0" encoding="utf-8"?>
-<p:properties xmlns:p="http://schemas.microsoft.com/office/2006/metadata/properties" xmlns:xsi="http://www.w3.org/2001/XMLSchema-instance" xmlns:pc="http://schemas.microsoft.com/office/infopath/2007/PartnerControls">
-  <documentManagement/>
-</p:properties>
-</file>
-
-<file path=customXml/item2.xml><?xml version="1.0" encoding="utf-8"?>
-<b:Sources xmlns:b="http://schemas.openxmlformats.org/officeDocument/2006/bibliography" xmlns="http://schemas.openxmlformats.org/officeDocument/2006/bibliography" SelectedStyle="\APASixthEditionOfficeOnline.xsl" StyleName="APA" Version="6"/>
-</file>
-
-<file path=customXml/item3.xml><?xml version="1.0" encoding="utf-8"?>
 <ct:contentTypeSchema xmlns:ct="http://schemas.microsoft.com/office/2006/metadata/contentType" xmlns:ma="http://schemas.microsoft.com/office/2006/metadata/properties/metaAttributes" ct:_="" ma:_="" ma:contentTypeName="Document" ma:contentTypeID="0x0101000A49EB99E6499D439FB507E92DFB948A" ma:contentTypeVersion="3" ma:contentTypeDescription="Create a new document." ma:contentTypeScope="" ma:versionID="4e6393af3769a3037de78fdd1e5290c4">
   <xsd:schema xmlns:xsd="http://www.w3.org/2001/XMLSchema" xmlns:xs="http://www.w3.org/2001/XMLSchema" xmlns:p="http://schemas.microsoft.com/office/2006/metadata/properties" xmlns:ns2="ba4cc30b-c043-49b1-8e93-4c9262a918f0" targetNamespace="http://schemas.microsoft.com/office/2006/metadata/properties" ma:root="true" ma:fieldsID="a22f4753efaf92b99cb84030fbd56b80" ns2:_="">
     <xsd:import namespace="ba4cc30b-c043-49b1-8e93-4c9262a918f0"/>
@@ -21976,6 +21953,16 @@
 </ct:contentTypeSchema>
 </file>
 
+<file path=customXml/item2.xml><?xml version="1.0" encoding="utf-8"?>
+<b:Sources xmlns:b="http://schemas.openxmlformats.org/officeDocument/2006/bibliography" xmlns="http://schemas.openxmlformats.org/officeDocument/2006/bibliography" SelectedStyle="\APASixthEditionOfficeOnline.xsl" StyleName="APA" Version="6"/>
+</file>
+
+<file path=customXml/item3.xml><?xml version="1.0" encoding="utf-8"?>
+<p:properties xmlns:p="http://schemas.microsoft.com/office/2006/metadata/properties" xmlns:xsi="http://www.w3.org/2001/XMLSchema-instance" xmlns:pc="http://schemas.microsoft.com/office/infopath/2007/PartnerControls">
+  <documentManagement/>
+</p:properties>
+</file>
+
 <file path=customXml/item4.xml><?xml version="1.0" encoding="utf-8"?>
 <?mso-contentType ?>
 <FormTemplates xmlns="http://schemas.microsoft.com/sharepoint/v3/contenttype/forms">
@@ -21986,23 +21973,6 @@
 </file>
 
 <file path=customXml/itemProps1.xml><?xml version="1.0" encoding="utf-8"?>
-<ds:datastoreItem xmlns:ds="http://schemas.openxmlformats.org/officeDocument/2006/customXml" ds:itemID="{B6ADF4F3-5389-4261-BA50-D9C1C4EE966F}">
-  <ds:schemaRefs>
-    <ds:schemaRef ds:uri="http://schemas.microsoft.com/office/2006/metadata/properties"/>
-    <ds:schemaRef ds:uri="http://schemas.microsoft.com/office/infopath/2007/PartnerControls"/>
-  </ds:schemaRefs>
-</ds:datastoreItem>
-</file>
-
-<file path=customXml/itemProps2.xml><?xml version="1.0" encoding="utf-8"?>
-<ds:datastoreItem xmlns:ds="http://schemas.openxmlformats.org/officeDocument/2006/customXml" ds:itemID="{98BD03B9-BFAB-42BE-8091-69031DD3A8CE}">
-  <ds:schemaRefs>
-    <ds:schemaRef ds:uri="http://schemas.openxmlformats.org/officeDocument/2006/bibliography"/>
-  </ds:schemaRefs>
-</ds:datastoreItem>
-</file>
-
-<file path=customXml/itemProps3.xml><?xml version="1.0" encoding="utf-8"?>
 <ds:datastoreItem xmlns:ds="http://schemas.openxmlformats.org/officeDocument/2006/customXml" ds:itemID="{CE2EA80F-BC29-4285-8F53-00433A445D1D}">
   <ds:schemaRefs>
     <ds:schemaRef ds:uri="http://schemas.microsoft.com/office/2006/metadata/contentType"/>
@@ -22020,6 +21990,23 @@
 </ds:datastoreItem>
 </file>
 
+<file path=customXml/itemProps2.xml><?xml version="1.0" encoding="utf-8"?>
+<ds:datastoreItem xmlns:ds="http://schemas.openxmlformats.org/officeDocument/2006/customXml" ds:itemID="{98BD03B9-BFAB-42BE-8091-69031DD3A8CE}">
+  <ds:schemaRefs>
+    <ds:schemaRef ds:uri="http://schemas.openxmlformats.org/officeDocument/2006/bibliography"/>
+  </ds:schemaRefs>
+</ds:datastoreItem>
+</file>
+
+<file path=customXml/itemProps3.xml><?xml version="1.0" encoding="utf-8"?>
+<ds:datastoreItem xmlns:ds="http://schemas.openxmlformats.org/officeDocument/2006/customXml" ds:itemID="{B6ADF4F3-5389-4261-BA50-D9C1C4EE966F}">
+  <ds:schemaRefs>
+    <ds:schemaRef ds:uri="http://schemas.microsoft.com/office/2006/metadata/properties"/>
+    <ds:schemaRef ds:uri="http://schemas.microsoft.com/office/infopath/2007/PartnerControls"/>
+  </ds:schemaRefs>
+</ds:datastoreItem>
+</file>
+
 <file path=customXml/itemProps4.xml><?xml version="1.0" encoding="utf-8"?>
 <ds:datastoreItem xmlns:ds="http://schemas.openxmlformats.org/officeDocument/2006/customXml" ds:itemID="{F4033E51-A133-484E-A999-B47BB42AC722}">
   <ds:schemaRefs>

</xml_diff>

<commit_message>
Update word template re again 2
</commit_message>
<xml_diff>
--- a/word_template.docx
+++ b/word_template.docx
@@ -4362,7 +4362,7 @@
     </w:p>
     <w:p>
       <w:r>
-        <w:t>{{data.General_Business_Overview.Schedule_of_Events.content}}</w:t>
+        <w:t>{{data.General_Business_Overview.Schedule_of_Events.content | default('')}}</w:t>
       </w:r>
     </w:p>
     <w:p>
@@ -4377,7 +4377,7 @@
     </w:p>
     <w:p>
       <w:r>
-        <w:t>{{data.General_Business_Overview.Contacts_Identified.content}}</w:t>
+        <w:t>{{data.General_Business_Overview.Contacts_Identified.content | default('')}}</w:t>
       </w:r>
     </w:p>
     <w:p>
@@ -4409,7 +4409,7 @@
           <w:lang w:val="en-IN" w:eastAsia="en-GB"/>
           <w14:ligatures w14:val="none"/>
         </w:rPr>
-        <w:t>{{data.General_Business_Overview.Industry_Categorization.content}}</w:t>
+        <w:t>{{data.General_Business_Overview.Industry_Categorization.content | default('')}}</w:t>
       </w:r>
     </w:p>
     <w:p/>
@@ -4425,7 +4425,7 @@
     </w:p>
     <w:p>
       <w:r>
-        <w:t>{{data.General_Business_Overview.Revenue_Band.content}}</w:t>
+        <w:t>{{data.General_Business_Overview.Revenue_Band.content | default('')}}</w:t>
       </w:r>
     </w:p>
     <w:p>
@@ -4457,7 +4457,7 @@
           <w:lang w:val="en-IN" w:eastAsia="en-GB"/>
           <w14:ligatures w14:val="none"/>
         </w:rPr>
-        <w:t>{{data.General_Business_Overview.Legal_Entities_and_Names.content}}</w:t>
+        <w:t>{{data.General_Business_Overview.Legal_Entities_and_Names.content | default('')}}</w:t>
       </w:r>
     </w:p>
     <w:p>
@@ -4472,7 +4472,7 @@
     </w:p>
     <w:p>
       <w:r>
-        <w:t>{{data.General_Business_Overview.Business_Locations.content}}</w:t>
+        <w:t>{{data.General_Business_Overview.Business_Locations.content | default('')}}</w:t>
       </w:r>
     </w:p>
     <w:p>
@@ -4504,7 +4504,7 @@
           <w:lang w:val="en-IN" w:eastAsia="en-GB"/>
           <w14:ligatures w14:val="none"/>
         </w:rPr>
-        <w:t>{{data.General_Business_Overview.Fiscal_Year_Format.content}}</w:t>
+        <w:t>{{data.General_Business_Overview.Fiscal_Year_Format.content | default('')}}</w:t>
       </w:r>
     </w:p>
     <w:p/>
@@ -4549,7 +4549,7 @@
         </w:rPr>
       </w:pPr>
       <w:r>
-        <w:t>{{data.General_Business_Overview.Total_SAP_Users.content}}</w:t>
+        <w:t>{{data.General_Business_Overview.Total_SAP_Users.content | default('')}}</w:t>
       </w:r>
     </w:p>
     <w:p>
@@ -4604,7 +4604,7 @@
           <w:lang w:val="en-IN" w:eastAsia="en-GB"/>
           <w14:ligatures w14:val="none"/>
         </w:rPr>
-        <w:t>{{data.General_Business_Overview.System_Landscape.content}}</w:t>
+        <w:t>{{data.General_Business_Overview.System_Landscape.content | default('')}}</w:t>
       </w:r>
     </w:p>
     <w:p>
@@ -4644,7 +4644,7 @@
           <w:lang w:val="en-IN" w:eastAsia="en-GB"/>
           <w14:ligatures w14:val="none"/>
         </w:rPr>
-        <w:t>{{data.General_Business_Overview.Key_Value_Drivers.content}}</w:t>
+        <w:t>{{data.General_Business_Overview.Key_Value_Drivers.content | default('')}}</w:t>
       </w:r>
     </w:p>
     <w:p/>
@@ -4661,7 +4661,7 @@
     </w:p>
     <w:p>
       <w:r>
-        <w:t>{{data.General_Business_Overview.Motivations_for_Transformation.content}}</w:t>
+        <w:t>{{data.General_Business_Overview.Motivations_for_Transformation.content | default('')}}</w:t>
       </w:r>
     </w:p>
     <w:p>
@@ -4694,7 +4694,7 @@
           <w:lang w:val="en-IN" w:eastAsia="en-GB"/>
           <w14:ligatures w14:val="none"/>
         </w:rPr>
-        <w:t>{{data.General_Business_Overview.Areas_of_Perceived_Competitive_Advantage.content}}</w:t>
+        <w:t>{{data.General_Business_Overview.Areas_of_Perceived_Competitive_Advantage.content | default('')}}</w:t>
       </w:r>
     </w:p>
     <w:p/>
@@ -4712,7 +4712,7 @@
     </w:p>
     <w:p>
       <w:r>
-        <w:t>{{data.General_Business_Overview.Perceived_Change_Resistance.content}}</w:t>
+        <w:t>{{data.General_Business_Overview.Perceived_Change_Resistance.content | default('')}}</w:t>
       </w:r>
     </w:p>
     <w:p>
@@ -4727,7 +4727,7 @@
     </w:p>
     <w:p>
       <w:r>
-        <w:t>{{data.General_Business_Overview.Technical_Challenges_and_Requirements.content}}</w:t>
+        <w:t>{{data.General_Business_Overview.Technical_Challenges_and_Requirements.content | default('')}}</w:t>
       </w:r>
     </w:p>
     <w:p>
@@ -4742,7 +4742,7 @@
     </w:p>
     <w:p>
       <w:r>
-        <w:t>{{data.General_Business_Overview.Regulatory_Compliance_Requirements.content}}</w:t>
+        <w:t>{{data.General_Business_Overview.Regulatory_Compliance_Requirements.content | default('')}}</w:t>
       </w:r>
     </w:p>
     <w:p>
@@ -4797,7 +4797,7 @@
           <w:lang w:val="en-IN" w:eastAsia="en-GB"/>
           <w14:ligatures w14:val="none"/>
         </w:rPr>
-        <w:t>{{data.General_Business_Overview.Transformation_Program_C_Suite_KPIs.content}}</w:t>
+        <w:t>{{data.General_Business_Overview.Transformation_Program_C_Suite_KPIs.content | default('')}}</w:t>
       </w:r>
     </w:p>
     <w:p>
@@ -4849,7 +4849,7 @@
         </w:rPr>
       </w:pPr>
       <w:r>
-        <w:t>{{data.General_Business_Overview.Key_Public_Cloud_Disqualifiers.content}}</w:t>
+        <w:t>{{data.General_Business_Overview.Key_Public_Cloud_Disqualifiers.content | default('')}}</w:t>
       </w:r>
     </w:p>
     <w:p>
@@ -4907,7 +4907,7 @@
           <w:lang w:val="en-IN" w:eastAsia="en-GB"/>
           <w14:ligatures w14:val="none"/>
         </w:rPr>
-        <w:t>{{data.Idea_to_Market.Current_Processes_Key_Findings.content}}</w:t>
+        <w:t>{{data.Idea_to_Market.Current_Processes_Key_Findings.content | default('')}}</w:t>
       </w:r>
     </w:p>
     <w:p/>
@@ -4924,7 +4924,7 @@
     </w:p>
     <w:p>
       <w:r>
-        <w:t>{{data.Idea_to_Market.Pain_Points.content}}</w:t>
+        <w:t>{{data.Idea_to_Market.Pain_Points.content | default('')}}</w:t>
       </w:r>
     </w:p>
     <w:p/>
@@ -4958,7 +4958,7 @@
           <w:lang w:val="en-IN" w:eastAsia="en-GB"/>
           <w14:ligatures w14:val="none"/>
         </w:rPr>
-        <w:t>{{data.Idea_to_Market.Proposed_SAP_Solutions_Mapping.content}}</w:t>
+        <w:t>{{data.Idea_to_Market.Proposed_SAP_Solutions_Mapping.content | default('')}}</w:t>
       </w:r>
     </w:p>
     <w:p/>
@@ -4975,7 +4975,7 @@
     </w:p>
     <w:p>
       <w:r>
-        <w:t>{{data.Idea_to_Market.Major_Gaps_and_Integrations.content}}</w:t>
+        <w:t>{{data.Idea_to_Market.Major_Gaps_and_Integrations.content | default('')}}</w:t>
       </w:r>
     </w:p>
     <w:p>
@@ -5046,7 +5046,7 @@
           <w:lang w:val="en-IN" w:eastAsia="en-GB"/>
           <w14:ligatures w14:val="none"/>
         </w:rPr>
-        <w:t>{{data.Source_to_Pay_S2P.Current_Processes_Key_Findings.content}}</w:t>
+        <w:t>{{data.Source_to_Pay_S2P.Current_Processes_Key_Findings.content | default('')}}</w:t>
       </w:r>
     </w:p>
     <w:p/>
@@ -5080,7 +5080,7 @@
           <w:lang w:val="en-IN" w:eastAsia="en-GB"/>
           <w14:ligatures w14:val="none"/>
         </w:rPr>
-        <w:t>{{data.Source_to_Pay_S2P.Pain_Points.content}}</w:t>
+        <w:t>{{data.Source_to_Pay_S2P.Pain_Points.content | default('')}}</w:t>
       </w:r>
     </w:p>
     <w:p/>
@@ -5095,7 +5095,7 @@
     </w:p>
     <w:p>
       <w:r>
-        <w:t>{{data.Source_to_Pay_S2P.Proposed_SAP_Solutions_Mapping.content}}</w:t>
+        <w:t>{{data.Source_to_Pay_S2P.Proposed_SAP_Solutions_Mapping.content | default('')}}</w:t>
       </w:r>
     </w:p>
     <w:p>
@@ -5110,7 +5110,7 @@
     </w:p>
     <w:p>
       <w:r>
-        <w:t>{{data.Source_to_Pay_S2P.Major_Gaps_and_Integrations.content}}</w:t>
+        <w:t>{{data.Source_to_Pay_S2P.Major_Gaps_and_Integrations.content | default('')}}</w:t>
       </w:r>
     </w:p>
     <w:p>
@@ -5136,7 +5136,7 @@
     </w:p>
     <w:p>
       <w:r>
-        <w:t>{{data.Plan_to_Produce_P2P.Current_Processes_Key_Findings.content}}</w:t>
+        <w:t>{{data.Plan_to_Produce_P2P.Current_Processes_Key_Findings.content | default('')}}</w:t>
       </w:r>
     </w:p>
     <w:p>
@@ -5151,7 +5151,7 @@
     </w:p>
     <w:p>
       <w:r>
-        <w:t>{{data.Plan_to_Produce_P2P.Pain_Points.content}}</w:t>
+        <w:t>{{data.Plan_to_Produce_P2P.Pain_Points.content | default('')}}</w:t>
       </w:r>
     </w:p>
     <w:p>
@@ -5166,7 +5166,7 @@
     </w:p>
     <w:p>
       <w:r>
-        <w:t>{{data.Plan_to_Produce_P2P.Proposed_SAP_Solutions_Mapping.content}}</w:t>
+        <w:t>{{data.Plan_to_Produce_P2P.Proposed_SAP_Solutions_Mapping.content | default('')}}</w:t>
       </w:r>
     </w:p>
     <w:p>
@@ -5181,7 +5181,7 @@
     </w:p>
     <w:p>
       <w:r>
-        <w:t>{{data.Plan_to_Produce_P2P.Major_Gaps_and_Integrations.content}}</w:t>
+        <w:t>{{data.Plan_to_Produce_P2P.Major_Gaps_and_Integrations.content | default('')}}</w:t>
       </w:r>
     </w:p>
     <w:p>
@@ -5222,7 +5222,7 @@
     </w:p>
     <w:p>
       <w:r>
-        <w:t>{{data.Detect_to_Correct_D2C.Current_Processes_Key_Findings.content}}</w:t>
+        <w:t>{{data.Detect_to_Correct_D2C.Current_Processes_Key_Findings.content | default('')}}</w:t>
       </w:r>
     </w:p>
     <w:p>
@@ -5237,7 +5237,7 @@
     </w:p>
     <w:p>
       <w:r>
-        <w:t>{{data.Detect_to_Correct_D2C.Pain_Points.content}}</w:t>
+        <w:t>{{data.Detect_to_Correct_D2C.Pain_Points.content | default('')}}</w:t>
       </w:r>
     </w:p>
     <w:p>
@@ -5269,7 +5269,7 @@
           <w:lang w:val="en-IN" w:eastAsia="en-GB"/>
           <w14:ligatures w14:val="none"/>
         </w:rPr>
-        <w:t>{{data.Detect_to_Correct_D2C.Proposed_SAP_Solutions_Mapping.content}}</w:t>
+        <w:t>{{data.Detect_to_Correct_D2C.Proposed_SAP_Solutions_Mapping.content | default('')}}</w:t>
       </w:r>
     </w:p>
     <w:p/>
@@ -5320,7 +5320,7 @@
           <w:lang w:val="en-IN" w:eastAsia="en-GB"/>
           <w14:ligatures w14:val="none"/>
         </w:rPr>
-        <w:t>{{data.Detect_to_Correct_D2C.Major_Gaps_and_Integrations.content}}</w:t>
+        <w:t>{{data.Detect_to_Correct_D2C.Major_Gaps_and_Integrations.content | default('')}}</w:t>
       </w:r>
     </w:p>
     <w:p/>
@@ -5365,7 +5365,7 @@
     </w:p>
     <w:p>
       <w:r>
-        <w:t>{{data.Forecast_to_Fulfill_F2F.Current_Processes_Key_Findings.content}}</w:t>
+        <w:t>{{data.Forecast_to_Fulfill_F2F.Current_Processes_Key_Findings.content | default('')}}</w:t>
       </w:r>
     </w:p>
     <w:p>
@@ -5379,7 +5379,7 @@
     </w:p>
     <w:p>
       <w:r>
-        <w:t>{{data.Forecast_to_Fulfill_F2F.Pain_Points.content}}</w:t>
+        <w:t>{{data.Forecast_to_Fulfill_F2F.Pain_Points.content | default('')}}</w:t>
       </w:r>
     </w:p>
     <w:p>
@@ -5411,7 +5411,7 @@
           <w:lang w:val="en-IN" w:eastAsia="en-GB"/>
           <w14:ligatures w14:val="none"/>
         </w:rPr>
-        <w:t>{{data.Forecast_to_Fulfill_F2F.Proposed_SAP_Solutions_Mapping.content}}</w:t>
+        <w:t>{{data.Forecast_to_Fulfill_F2F.Proposed_SAP_Solutions_Mapping.content | default('')}}</w:t>
       </w:r>
     </w:p>
     <w:p/>
@@ -5434,7 +5434,7 @@
         <w:pStyle w:val="HTMLPreformatted"/>
       </w:pPr>
       <w:r>
-        <w:t>{{data.Forecast_to_Fulfill_F2F.Major_Gaps_and_Integrations.content}}</w:t>
+        <w:t>{{data.Forecast_to_Fulfill_F2F.Major_Gaps_and_Integrations.content | default('')}}</w:t>
       </w:r>
     </w:p>
     <w:p>
@@ -5480,7 +5480,7 @@
     </w:p>
     <w:p>
       <w:r>
-        <w:t>{{data.Warehouse_Execution_WM_EWM.Current_Processes_Key_Findings.content}}</w:t>
+        <w:t>{{data.Warehouse_Execution_WM_EWM.Current_Processes_Key_Findings.content | default('')}}</w:t>
       </w:r>
     </w:p>
     <w:p>
@@ -5512,7 +5512,7 @@
           <w:lang w:val="en-IN" w:eastAsia="en-GB"/>
           <w14:ligatures w14:val="none"/>
         </w:rPr>
-        <w:t>{{data.Warehouse_Execution_WM_EWM.Pain_Points.content}}</w:t>
+        <w:t>{{data.Warehouse_Execution_WM_EWM.Pain_Points.content | default('')}}</w:t>
       </w:r>
     </w:p>
     <w:p>
@@ -5544,7 +5544,7 @@
           <w:lang w:val="en-IN" w:eastAsia="en-GB"/>
           <w14:ligatures w14:val="none"/>
         </w:rPr>
-        <w:t>{{data.Warehouse_Execution_WM_EWM.Proposed_SAP_Solutions_Mapping.content}}</w:t>
+        <w:t>{{data.Warehouse_Execution_WM_EWM.Proposed_SAP_Solutions_Mapping.content | default('')}}</w:t>
       </w:r>
     </w:p>
     <w:p/>
@@ -5585,7 +5585,7 @@
           <w:sz w:val="24"/>
           <w:szCs w:val="24"/>
         </w:rPr>
-        <w:t>{{data.Warehouse_Execution_WM_EWM.Major_Gaps_and_Integrations.content}}</w:t>
+        <w:t>{{data.Warehouse_Execution_WM_EWM.Major_Gaps_and_Integrations.content | default('')}}</w:t>
       </w:r>
       <w:r>
         <w:rPr>
@@ -5656,7 +5656,7 @@
           <w:lang w:val="en-IN" w:eastAsia="en-GB"/>
           <w14:ligatures w14:val="none"/>
         </w:rPr>
-        <w:t>{{data.Lead_to_Cash_L2C.Current_Processes_Key_Findings.content}}</w:t>
+        <w:t>{{data.Lead_to_Cash_L2C.Current_Processes_Key_Findings.content | default('')}}</w:t>
       </w:r>
     </w:p>
     <w:p/>
@@ -5689,7 +5689,7 @@
           <w:lang w:val="en-IN" w:eastAsia="en-GB"/>
           <w14:ligatures w14:val="none"/>
         </w:rPr>
-        <w:t>{{data.Lead_to_Cash_L2C.Pain_Points.content}}</w:t>
+        <w:t>{{data.Lead_to_Cash_L2C.Pain_Points.content | default('')}}</w:t>
       </w:r>
     </w:p>
     <w:p/>
@@ -5722,7 +5722,7 @@
           <w:lang w:val="en-IN" w:eastAsia="en-GB"/>
           <w14:ligatures w14:val="none"/>
         </w:rPr>
-        <w:t>{{data.Lead_to_Cash_L2C.Proposed_SAP_Solutions_Mapping.content}}</w:t>
+        <w:t>{{data.Lead_to_Cash_L2C.Proposed_SAP_Solutions_Mapping.content | default('')}}</w:t>
       </w:r>
     </w:p>
     <w:p/>
@@ -5739,7 +5739,7 @@
     </w:p>
     <w:p>
       <w:r>
-        <w:t>{{data.Lead_to_Cash_L2C.Major_Gaps_and_Integrations.content}}</w:t>
+        <w:t>{{data.Lead_to_Cash_L2C.Major_Gaps_and_Integrations.content | default('')}}</w:t>
       </w:r>
     </w:p>
     <w:p>
@@ -5765,7 +5765,7 @@
     </w:p>
     <w:p>
       <w:r>
-        <w:t>{{data.Logistics_Planning_and_Transportation_TM.Current_Processes_Key_Findings.content}}</w:t>
+        <w:t>{{data.Logistics_Planning_and_Transportation_TM.Current_Processes_Key_Findings.content | default('')}}</w:t>
       </w:r>
     </w:p>
     <w:p>
@@ -5780,7 +5780,7 @@
     </w:p>
     <w:p>
       <w:r>
-        <w:t>{{data.Logistics_Planning_and_Transportation_TM.Pain_Points.content}}</w:t>
+        <w:t>{{data.Logistics_Planning_and_Transportation_TM.Pain_Points.content | default('')}}</w:t>
       </w:r>
     </w:p>
     <w:p>
@@ -5812,7 +5812,7 @@
           <w:lang w:val="en-IN" w:eastAsia="en-GB"/>
           <w14:ligatures w14:val="none"/>
         </w:rPr>
-        <w:t>{{data.Logistics_Planning_and_Transportation_TM.Proposed_SAP_Solutions_Mapping.content}}</w:t>
+        <w:t>{{data.Logistics_Planning_and_Transportation_TM.Proposed_SAP_Solutions_Mapping.content | default('')}}</w:t>
       </w:r>
     </w:p>
     <w:p/>
@@ -5835,7 +5835,7 @@
         <w:pStyle w:val="HTMLPreformatted"/>
       </w:pPr>
       <w:r>
-        <w:t>{{data.Logistics_Planning_and_Transportation_TM.Major_Gaps_and_Integrations.content}}</w:t>
+        <w:t>{{data.Logistics_Planning_and_Transportation_TM.Major_Gaps_and_Integrations.content | default('')}}</w:t>
       </w:r>
     </w:p>
     <w:p>
@@ -5913,7 +5913,7 @@
           <w:lang w:val="en-IN" w:eastAsia="en-GB"/>
           <w14:ligatures w14:val="none"/>
         </w:rPr>
-        <w:t>{{data.Request_to_Service_R2S.Current_Processes_Key_Findings.content}}</w:t>
+        <w:t>{{data.Request_to_Service_R2S.Current_Processes_Key_Findings.content | default('')}}</w:t>
       </w:r>
     </w:p>
     <w:p/>
@@ -5946,7 +5946,7 @@
           <w:lang w:val="en-IN" w:eastAsia="en-GB"/>
           <w14:ligatures w14:val="none"/>
         </w:rPr>
-        <w:t>{{data.Request_to_Service_R2S.Pain_Points.content}}</w:t>
+        <w:t>{{data.Request_to_Service_R2S.Pain_Points.content | default('')}}</w:t>
       </w:r>
     </w:p>
     <w:p>
@@ -5961,7 +5961,7 @@
     </w:p>
     <w:p>
       <w:r>
-        <w:t>{{data.Request_to_Service_R2S.Proposed_SAP_Solutions_Mapping.content}}</w:t>
+        <w:t>{{data.Request_to_Service_R2S.Proposed_SAP_Solutions_Mapping.content | default('')}}</w:t>
       </w:r>
     </w:p>
     <w:p>
@@ -5983,7 +5983,7 @@
         <w:pStyle w:val="HTMLPreformatted"/>
       </w:pPr>
       <w:r>
-        <w:t>{{data.Request_to_Service_R2S.Major_Gaps_and_Integrations.content}}</w:t>
+        <w:t>{{data.Request_to_Service_R2S.Major_Gaps_and_Integrations.content | default('')}}</w:t>
       </w:r>
     </w:p>
     <w:p>
@@ -6034,7 +6034,7 @@
     </w:p>
     <w:p>
       <w:r>
-        <w:t>{{data.Record_to_Report_R2R.Current_Processes_Key_Findings.content}}</w:t>
+        <w:t>{{data.Record_to_Report_R2R.Current_Processes_Key_Findings.content | default('')}}</w:t>
       </w:r>
     </w:p>
     <w:p>
@@ -6066,7 +6066,7 @@
           <w:lang w:val="en-IN" w:eastAsia="en-GB"/>
           <w14:ligatures w14:val="none"/>
         </w:rPr>
-        <w:t>{{data.Record_to_Report_R2R.Pain_Points.content}}</w:t>
+        <w:t>{{data.Record_to_Report_R2R.Pain_Points.content | default('')}}</w:t>
       </w:r>
     </w:p>
     <w:p/>
@@ -6082,7 +6082,7 @@
     </w:p>
     <w:p>
       <w:r>
-        <w:t>{{data.Record_to_Report_R2R.Proposed_SAP_Solutions_Mapping.content}}</w:t>
+        <w:t>{{data.Record_to_Report_R2R.Proposed_SAP_Solutions_Mapping.content | default('')}}</w:t>
       </w:r>
     </w:p>
     <w:p>
@@ -6100,7 +6100,7 @@
         <w:pStyle w:val="HTMLPreformatted"/>
       </w:pPr>
       <w:r>
-        <w:t>{{data.Record_to_Report_R2R.Major_Gaps_and_Integrations.content}}</w:t>
+        <w:t>{{data.Record_to_Report_R2R.Major_Gaps_and_Integrations.content | default('')}}</w:t>
       </w:r>
     </w:p>
     <w:p/>
@@ -6155,7 +6155,7 @@
     </w:p>
     <w:p>
       <w:r>
-        <w:t>{{data.Acquire_to_Dispose_A2D.Current_Processes_Key_Findings.content}}</w:t>
+        <w:t>{{data.Acquire_to_Dispose_A2D.Current_Processes_Key_Findings.content | default('')}}</w:t>
       </w:r>
     </w:p>
     <w:p>
@@ -6170,7 +6170,7 @@
     </w:p>
     <w:p>
       <w:r>
-        <w:t>{{data.Acquire_to_Dispose_A2D.Pain_Points.content}}</w:t>
+        <w:t>{{data.Acquire_to_Dispose_A2D.Pain_Points.content | default('')}}</w:t>
       </w:r>
     </w:p>
     <w:p>
@@ -6185,7 +6185,7 @@
     </w:p>
     <w:p>
       <w:r>
-        <w:t>{{data.Acquire_to_Dispose_A2D.Proposed_SAP_Solutions_Mapping.content}}</w:t>
+        <w:t>{{data.Acquire_to_Dispose_A2D.Proposed_SAP_Solutions_Mapping.content | default('')}}</w:t>
       </w:r>
     </w:p>
     <w:p>
@@ -6207,7 +6207,7 @@
         <w:pStyle w:val="HTMLPreformatted"/>
       </w:pPr>
       <w:r>
-        <w:t>{{data.Acquire_to_Dispose_A2D.Major_Gaps_and_Integrations.content}}</w:t>
+        <w:t>{{data.Acquire_to_Dispose_A2D.Major_Gaps_and_Integrations.content | default('')}}</w:t>
       </w:r>
     </w:p>
     <w:p>
@@ -6278,7 +6278,7 @@
         </w:rPr>
       </w:pPr>
       <w:r>
-        <w:t>{{data.Environmental_Social_and_Governance_ESG_Processes.Current_Processes_Key_Findings.content}}</w:t>
+        <w:t>{{data.Environmental_Social_and_Governance_ESG_Processes.Current_Processes_Key_Findings.content | default('')}}</w:t>
       </w:r>
     </w:p>
     <w:p>
@@ -6310,7 +6310,7 @@
           <w:lang w:val="en-IN" w:eastAsia="en-GB"/>
           <w14:ligatures w14:val="none"/>
         </w:rPr>
-        <w:t>{{data.Environmental_Social_and_Governance_ESG_Processes.Pain_Points.content}}</w:t>
+        <w:t>{{data.Environmental_Social_and_Governance_ESG_Processes.Pain_Points.content | default('')}}</w:t>
       </w:r>
     </w:p>
     <w:p/>
@@ -6336,7 +6336,7 @@
         </w:rPr>
       </w:pPr>
       <w:r>
-        <w:t>{{data.Environmental_Social_and_Governance_ESG_Processes.Proposed_SAP_Solutions_Mapping.content}}</w:t>
+        <w:t>{{data.Environmental_Social_and_Governance_ESG_Processes.Proposed_SAP_Solutions_Mapping.content | default('')}}</w:t>
       </w:r>
     </w:p>
     <w:p/>
@@ -6359,7 +6359,7 @@
         <w:pStyle w:val="HTMLPreformatted"/>
       </w:pPr>
       <w:r>
-        <w:t>{{data.Environmental_Social_and_Governance_ESG_Processes.Major_Gaps_and_Integrations.content}}</w:t>
+        <w:t>{{data.Environmental_Social_and_Governance_ESG_Processes.Major_Gaps_and_Integrations.content | default('')}}</w:t>
       </w:r>
     </w:p>
     <w:p>
@@ -6423,7 +6423,7 @@
     </w:p>
     <w:p>
       <w:r>
-        <w:t>{{data.Hire_to_Retire_H2R.Current_Processes_Key_Findings.content}}</w:t>
+        <w:t>{{data.Hire_to_Retire_H2R.Current_Processes_Key_Findings.content | default('')}}</w:t>
       </w:r>
     </w:p>
     <w:p>
@@ -6438,7 +6438,7 @@
     </w:p>
     <w:p>
       <w:r>
-        <w:t>{{data.Hire_to_Retire_H2R.Pain_Points.content}}</w:t>
+        <w:t>{{data.Hire_to_Retire_H2R.Pain_Points.content | default('')}}</w:t>
       </w:r>
     </w:p>
     <w:p>
@@ -6453,7 +6453,7 @@
     </w:p>
     <w:p>
       <w:r>
-        <w:t>{{data.Hire_to_Retire_H2R.Proposed_SAP_Solutions_Mapping.content}}</w:t>
+        <w:t>{{data.Hire_to_Retire_H2R.Proposed_SAP_Solutions_Mapping.content | default('')}}</w:t>
       </w:r>
     </w:p>
     <w:p>
@@ -6475,7 +6475,7 @@
         <w:pStyle w:val="HTMLPreformatted"/>
       </w:pPr>
       <w:r>
-        <w:t>{{data.Hire_to_Retire_H2R.Major_Gaps_and_Integrations.content}}</w:t>
+        <w:t>{{data.Hire_to_Retire_H2R.Major_Gaps_and_Integrations.content | default('')}}</w:t>
       </w:r>
     </w:p>
     <w:p>
@@ -6533,7 +6533,7 @@
     </w:p>
     <w:p>
       <w:r>
-        <w:t>{{data.Enterprise_Reporting_Data_and_Analytics_Strategy.Current_Processes_Key_Findings.content}}</w:t>
+        <w:t>{{data.Enterprise_Reporting_Data_and_Analytics_Strategy.Current_Processes_Key_Findings.content | default('')}}</w:t>
       </w:r>
     </w:p>
     <w:p>
@@ -6548,7 +6548,7 @@
     </w:p>
     <w:p>
       <w:r>
-        <w:t>{{data.Enterprise_Reporting_Data_and_Analytics_Strategy.Pain_Points.content}}</w:t>
+        <w:t>{{data.Enterprise_Reporting_Data_and_Analytics_Strategy.Pain_Points.content | default('')}}</w:t>
       </w:r>
     </w:p>
     <w:p>
@@ -6563,7 +6563,7 @@
     </w:p>
     <w:p>
       <w:r>
-        <w:t>{{data.Enterprise_Reporting_Data_and_Analytics_Strategy.Proposed_SAP_Solutions_Mapping.content}}</w:t>
+        <w:t>{{data.Enterprise_Reporting_Data_and_Analytics_Strategy.Proposed_SAP_Solutions_Mapping.content | default('')}}</w:t>
       </w:r>
     </w:p>
     <w:p>
@@ -6578,7 +6578,7 @@
     </w:p>
     <w:p>
       <w:r>
-        <w:t>{{data.Enterprise_Reporting_Data_and_Analytics_Strategy.Major_Gaps_and_Integrations.content}}</w:t>
+        <w:t>{{data.Enterprise_Reporting_Data_and_Analytics_Strategy.Major_Gaps_and_Integrations.content | default('')}}</w:t>
       </w:r>
     </w:p>
     <w:p>

</xml_diff>